<commit_message>
Práctica 5: servicio gRPC interno consumido por el REST
</commit_message>
<xml_diff>
--- a/practicas/practica 5/Práctica N5 David Franz Soliz Ortega.docx
+++ b/practicas/practica 5/Práctica N5 David Franz Soliz Ortega.docx
@@ -6,23 +6,13 @@
       <w:pPr>
         <w:spacing w:after="40"/>
       </w:pPr>
-      <w:proofErr w:type="gramStart"/>
       <w:r>
         <w:rPr>
           <w:b/>
           <w:bCs/>
           <w:color w:val="1F8A7A"/>
         </w:rPr>
-        <w:t>PRÁCTICA N.º</w:t>
-      </w:r>
-      <w:proofErr w:type="gramEnd"/>
-      <w:r>
-        <w:rPr>
-          <w:b/>
-          <w:bCs/>
-          <w:color w:val="1F8A7A"/>
-        </w:rPr>
-        <w:t xml:space="preserve"> 5 — HOJA DE EVIDENCIAS</w:t>
+        <w:t>PRÁCTICA N.º 5 — HOJA DE EVIDENCIAS</w:t>
       </w:r>
     </w:p>
     <w:p>
@@ -37,20 +27,8 @@
           <w:sz w:val="30"/>
           <w:szCs w:val="30"/>
         </w:rPr>
-        <w:t xml:space="preserve">Comunicación de alto rendimiento con </w:t>
-      </w:r>
-      <w:proofErr w:type="spellStart"/>
-      <w:r>
-        <w:rPr>
-          <w:b/>
-          <w:bCs/>
-          <w:color w:val="0F3D5C"/>
-          <w:sz w:val="30"/>
-          <w:szCs w:val="30"/>
-        </w:rPr>
-        <w:t>gRPC</w:t>
-      </w:r>
-      <w:proofErr w:type="spellEnd"/>
+        <w:t>Comunicación de alto rendimiento con gRPC</w:t>
+      </w:r>
     </w:p>
     <w:p>
       <w:pPr>
@@ -87,12 +65,6 @@
         <w:gridCol w:w="7146"/>
       </w:tblGrid>
       <w:tr>
-        <w:tblPrEx>
-          <w:tblCellMar>
-            <w:top w:w="0" w:type="dxa"/>
-            <w:bottom w:w="0" w:type="dxa"/>
-          </w:tblCellMar>
-        </w:tblPrEx>
         <w:tc>
           <w:tcPr>
             <w:tcW w:w="2600" w:type="dxa"/>
@@ -136,12 +108,6 @@
         </w:tc>
       </w:tr>
       <w:tr>
-        <w:tblPrEx>
-          <w:tblCellMar>
-            <w:top w:w="0" w:type="dxa"/>
-            <w:bottom w:w="0" w:type="dxa"/>
-          </w:tblCellMar>
-        </w:tblPrEx>
         <w:tc>
           <w:tcPr>
             <w:tcW w:w="2600" w:type="dxa"/>
@@ -185,12 +151,6 @@
         </w:tc>
       </w:tr>
       <w:tr>
-        <w:tblPrEx>
-          <w:tblCellMar>
-            <w:top w:w="0" w:type="dxa"/>
-            <w:bottom w:w="0" w:type="dxa"/>
-          </w:tblCellMar>
-        </w:tblPrEx>
         <w:tc>
           <w:tcPr>
             <w:tcW w:w="2600" w:type="dxa"/>
@@ -234,12 +194,6 @@
         </w:tc>
       </w:tr>
       <w:tr>
-        <w:tblPrEx>
-          <w:tblCellMar>
-            <w:top w:w="0" w:type="dxa"/>
-            <w:bottom w:w="0" w:type="dxa"/>
-          </w:tblCellMar>
-        </w:tblPrEx>
         <w:tc>
           <w:tcPr>
             <w:tcW w:w="2600" w:type="dxa"/>
@@ -283,12 +237,6 @@
         </w:tc>
       </w:tr>
       <w:tr>
-        <w:tblPrEx>
-          <w:tblCellMar>
-            <w:top w:w="0" w:type="dxa"/>
-            <w:bottom w:w="0" w:type="dxa"/>
-          </w:tblCellMar>
-        </w:tblPrEx>
         <w:tc>
           <w:tcPr>
             <w:tcW w:w="2600" w:type="dxa"/>
@@ -309,27 +257,7 @@
                 <w:sz w:val="18"/>
                 <w:szCs w:val="18"/>
               </w:rPr>
-              <w:t xml:space="preserve">Sistema operativo, versión de </w:t>
-            </w:r>
-            <w:proofErr w:type="spellStart"/>
-            <w:r>
-              <w:rPr>
-                <w:b/>
-                <w:bCs/>
-                <w:sz w:val="18"/>
-                <w:szCs w:val="18"/>
-              </w:rPr>
-              <w:t>Node</w:t>
-            </w:r>
-            <w:proofErr w:type="spellEnd"/>
-            <w:r>
-              <w:rPr>
-                <w:b/>
-                <w:bCs/>
-                <w:sz w:val="18"/>
-                <w:szCs w:val="18"/>
-              </w:rPr>
-              <w:t xml:space="preserve"> y de Docker</w:t>
+              <w:t>Sistema operativo, versión de Node y de Docker</w:t>
             </w:r>
           </w:p>
         </w:tc>
@@ -348,24 +276,11 @@
             <w:r>
               <w:t xml:space="preserve">Windows 10 64 bits, </w:t>
             </w:r>
-            <w:proofErr w:type="spellStart"/>
-            <w:r>
-              <w:t>node</w:t>
-            </w:r>
-            <w:proofErr w:type="spellEnd"/>
-            <w:r>
-              <w:t xml:space="preserve"> </w:t>
-            </w:r>
-            <w:proofErr w:type="gramStart"/>
-            <w:r>
-              <w:t>24.18.1,</w:t>
-            </w:r>
-            <w:r>
-              <w:t>mysql</w:t>
-            </w:r>
-            <w:proofErr w:type="gramEnd"/>
-            <w:r>
-              <w:t xml:space="preserve"> 8.10,docker</w:t>
+            <w:r>
+              <w:t>node 24.18.1,</w:t>
+            </w:r>
+            <w:r>
+              <w:t>mysql 8.10,docker</w:t>
             </w:r>
             <w:r>
               <w:t xml:space="preserve">  29.7.2</w:t>
@@ -374,12 +289,6 @@
         </w:tc>
       </w:tr>
       <w:tr>
-        <w:tblPrEx>
-          <w:tblCellMar>
-            <w:top w:w="0" w:type="dxa"/>
-            <w:bottom w:w="0" w:type="dxa"/>
-          </w:tblCellMar>
-        </w:tblPrEx>
         <w:tc>
           <w:tcPr>
             <w:tcW w:w="2600" w:type="dxa"/>
@@ -445,12 +354,6 @@
         <w:gridCol w:w="9746"/>
       </w:tblGrid>
       <w:tr>
-        <w:tblPrEx>
-          <w:tblCellMar>
-            <w:top w:w="0" w:type="dxa"/>
-            <w:bottom w:w="0" w:type="dxa"/>
-          </w:tblCellMar>
-        </w:tblPrEx>
         <w:tc>
           <w:tcPr>
             <w:tcW w:w="9746" w:type="dxa"/>
@@ -486,10 +389,7 @@
               <w:jc w:val="both"/>
             </w:pPr>
             <w:r>
-              <w:t xml:space="preserve">Las capturas deben ser de su propia máquina: debe verse el nombre de usuario o del equipo en la terminal. Recorte solo </w:t>
-            </w:r>
-            <w:r>
-              <w:t>lo necesario, pero que el comando y su salida se lean con claridad.</w:t>
+              <w:t>Las capturas deben ser de su propia máquina: debe verse el nombre de usuario o del equipo en la terminal. Recorte solo lo necesario, pero que el comando y su salida se lean con claridad.</w:t>
             </w:r>
           </w:p>
           <w:p>
@@ -555,12 +455,6 @@
         <w:gridCol w:w="1546"/>
       </w:tblGrid>
       <w:tr>
-        <w:tblPrEx>
-          <w:tblCellMar>
-            <w:top w:w="0" w:type="dxa"/>
-            <w:bottom w:w="0" w:type="dxa"/>
-          </w:tblCellMar>
-        </w:tblPrEx>
         <w:trPr>
           <w:tblHeader/>
         </w:trPr>
@@ -674,12 +568,6 @@
         </w:tc>
       </w:tr>
       <w:tr>
-        <w:tblPrEx>
-          <w:tblCellMar>
-            <w:top w:w="0" w:type="dxa"/>
-            <w:bottom w:w="0" w:type="dxa"/>
-          </w:tblCellMar>
-        </w:tblPrEx>
         <w:tc>
           <w:tcPr>
             <w:tcW w:w="5200" w:type="dxa"/>
@@ -762,12 +650,6 @@
         </w:tc>
       </w:tr>
       <w:tr>
-        <w:tblPrEx>
-          <w:tblCellMar>
-            <w:top w:w="0" w:type="dxa"/>
-            <w:bottom w:w="0" w:type="dxa"/>
-          </w:tblCellMar>
-        </w:tblPrEx>
         <w:tc>
           <w:tcPr>
             <w:tcW w:w="5200" w:type="dxa"/>
@@ -785,23 +667,7 @@
                 <w:sz w:val="18"/>
                 <w:szCs w:val="18"/>
               </w:rPr>
-              <w:t xml:space="preserve">Laboratorio 1 — El </w:t>
-            </w:r>
-            <w:proofErr w:type="gramStart"/>
-            <w:r>
-              <w:rPr>
-                <w:sz w:val="18"/>
-                <w:szCs w:val="18"/>
-              </w:rPr>
-              <w:t>archivo .proto</w:t>
-            </w:r>
-            <w:proofErr w:type="gramEnd"/>
-            <w:r>
-              <w:rPr>
-                <w:sz w:val="18"/>
-                <w:szCs w:val="18"/>
-              </w:rPr>
-              <w:t xml:space="preserve"> como contrato</w:t>
+              <w:t>Laboratorio 1 — El archivo .proto como contrato</w:t>
             </w:r>
           </w:p>
         </w:tc>
@@ -866,12 +732,6 @@
         </w:tc>
       </w:tr>
       <w:tr>
-        <w:tblPrEx>
-          <w:tblCellMar>
-            <w:top w:w="0" w:type="dxa"/>
-            <w:bottom w:w="0" w:type="dxa"/>
-          </w:tblCellMar>
-        </w:tblPrEx>
         <w:tc>
           <w:tcPr>
             <w:tcW w:w="5200" w:type="dxa"/>
@@ -954,12 +814,6 @@
         </w:tc>
       </w:tr>
       <w:tr>
-        <w:tblPrEx>
-          <w:tblCellMar>
-            <w:top w:w="0" w:type="dxa"/>
-            <w:bottom w:w="0" w:type="dxa"/>
-          </w:tblCellMar>
-        </w:tblPrEx>
         <w:tc>
           <w:tcPr>
             <w:tcW w:w="5200" w:type="dxa"/>
@@ -977,17 +831,8 @@
                 <w:sz w:val="18"/>
                 <w:szCs w:val="18"/>
               </w:rPr>
-              <w:t xml:space="preserve">Laboratorio 3 — El cliente y los códigos de estado de </w:t>
-            </w:r>
-            <w:proofErr w:type="spellStart"/>
-            <w:r>
-              <w:rPr>
-                <w:sz w:val="18"/>
-                <w:szCs w:val="18"/>
-              </w:rPr>
-              <w:t>gRPC</w:t>
-            </w:r>
-            <w:proofErr w:type="spellEnd"/>
+              <w:t>Laboratorio 3 — El cliente y los códigos de estado de gRPC</w:t>
+            </w:r>
           </w:p>
         </w:tc>
         <w:tc>
@@ -1051,12 +896,6 @@
         </w:tc>
       </w:tr>
       <w:tr>
-        <w:tblPrEx>
-          <w:tblCellMar>
-            <w:top w:w="0" w:type="dxa"/>
-            <w:bottom w:w="0" w:type="dxa"/>
-          </w:tblCellMar>
-        </w:tblPrEx>
         <w:tc>
           <w:tcPr>
             <w:tcW w:w="5200" w:type="dxa"/>
@@ -1074,23 +913,7 @@
                 <w:sz w:val="18"/>
                 <w:szCs w:val="18"/>
               </w:rPr>
-              <w:t xml:space="preserve">Laboratorio 4 — </w:t>
-            </w:r>
-            <w:proofErr w:type="spellStart"/>
-            <w:r>
-              <w:rPr>
-                <w:sz w:val="18"/>
-                <w:szCs w:val="18"/>
-              </w:rPr>
-              <w:t>Streaming</w:t>
-            </w:r>
-            <w:proofErr w:type="spellEnd"/>
-            <w:r>
-              <w:rPr>
-                <w:sz w:val="18"/>
-                <w:szCs w:val="18"/>
-              </w:rPr>
-              <w:t>: cuando una sola respuesta no alcanza</w:t>
+              <w:t>Laboratorio 4 — Streaming: cuando una sola respuesta no alcanza</w:t>
             </w:r>
           </w:p>
         </w:tc>
@@ -1155,12 +978,6 @@
         </w:tc>
       </w:tr>
       <w:tr>
-        <w:tblPrEx>
-          <w:tblCellMar>
-            <w:top w:w="0" w:type="dxa"/>
-            <w:bottom w:w="0" w:type="dxa"/>
-          </w:tblCellMar>
-        </w:tblPrEx>
         <w:tc>
           <w:tcPr>
             <w:tcW w:w="5200" w:type="dxa"/>
@@ -1243,12 +1060,6 @@
         </w:tc>
       </w:tr>
       <w:tr>
-        <w:tblPrEx>
-          <w:tblCellMar>
-            <w:top w:w="0" w:type="dxa"/>
-            <w:bottom w:w="0" w:type="dxa"/>
-          </w:tblCellMar>
-        </w:tblPrEx>
         <w:tc>
           <w:tcPr>
             <w:tcW w:w="5200" w:type="dxa"/>
@@ -1413,12 +1224,6 @@
         <w:gridCol w:w="9950"/>
       </w:tblGrid>
       <w:tr>
-        <w:tblPrEx>
-          <w:tblCellMar>
-            <w:top w:w="0" w:type="dxa"/>
-            <w:bottom w:w="0" w:type="dxa"/>
-          </w:tblCellMar>
-        </w:tblPrEx>
         <w:trPr>
           <w:trHeight w:val="2100"/>
         </w:trPr>
@@ -1493,53 +1298,20 @@
         <w:spacing w:after="80" w:line="260" w:lineRule="auto"/>
         <w:jc w:val="both"/>
       </w:pPr>
-      <w:proofErr w:type="gramStart"/>
       <w:r>
         <w:rPr>
           <w:b/>
           <w:bCs/>
           <w:color w:val="0F3D5C"/>
         </w:rPr>
-        <w:t>Pregunta N.º</w:t>
-      </w:r>
-      <w:proofErr w:type="gramEnd"/>
-      <w:r>
-        <w:rPr>
-          <w:b/>
-          <w:bCs/>
-          <w:color w:val="0F3D5C"/>
-        </w:rPr>
-        <w:t xml:space="preserve"> 1. </w:t>
+        <w:t xml:space="preserve">Pregunta N.º 1. </w:t>
       </w:r>
       <w:r>
         <w:rPr>
           <w:b/>
           <w:bCs/>
         </w:rPr>
-        <w:t xml:space="preserve">Ya cuenta con un servicio REST y con una capa </w:t>
-      </w:r>
-      <w:proofErr w:type="spellStart"/>
-      <w:r>
-        <w:rPr>
-          <w:b/>
-          <w:bCs/>
-        </w:rPr>
-        <w:t>GraphQL</w:t>
-      </w:r>
-      <w:proofErr w:type="spellEnd"/>
-      <w:r>
-        <w:rPr>
-          <w:b/>
-          <w:bCs/>
-        </w:rPr>
-        <w:t>. Describa una situación concreta de su proyecto integrador —quién llama a quién, cada cuánto y con qué volumen de datos— en la que agregar un tercer estilo de comunicación estaría justificado. Si no enc</w:t>
-      </w:r>
-      <w:r>
-        <w:rPr>
-          <w:b/>
-          <w:bCs/>
-        </w:rPr>
-        <w:t>uentra ninguna, dígalo y explique por qué.</w:t>
+        <w:t>Ya cuenta con un servicio REST y con una capa GraphQL. Describa una situación concreta de su proyecto integrador —quién llama a quién, cada cuánto y con qué volumen de datos— en la que agregar un tercer estilo de comunicación estaría justificado. Si no encuentra ninguna, dígalo y explique por qué.</w:t>
       </w:r>
     </w:p>
     <w:tbl>
@@ -1563,12 +1335,6 @@
         <w:gridCol w:w="9746"/>
       </w:tblGrid>
       <w:tr>
-        <w:tblPrEx>
-          <w:tblCellMar>
-            <w:top w:w="0" w:type="dxa"/>
-            <w:bottom w:w="0" w:type="dxa"/>
-          </w:tblCellMar>
-        </w:tblPrEx>
         <w:trPr>
           <w:trHeight w:val="1400"/>
         </w:trPr>
@@ -1610,23 +1376,7 @@
         <w:t xml:space="preserve">Captura N.º 2: </w:t>
       </w:r>
       <w:r>
-        <w:t xml:space="preserve">salida de </w:t>
-      </w:r>
-      <w:proofErr w:type="spellStart"/>
-      <w:r>
-        <w:t>npm</w:t>
-      </w:r>
-      <w:proofErr w:type="spellEnd"/>
-      <w:r>
-        <w:t xml:space="preserve"> </w:t>
-      </w:r>
-      <w:proofErr w:type="spellStart"/>
-      <w:r>
-        <w:t>install</w:t>
-      </w:r>
-      <w:proofErr w:type="spellEnd"/>
-      <w:r>
-        <w:t xml:space="preserve"> mostrando los dos paquetes instalados y la estructura de carpetas creada.</w:t>
+        <w:t>salida de npm install mostrando los dos paquetes instalados y la estructura de carpetas creada.</w:t>
       </w:r>
     </w:p>
     <w:tbl>
@@ -1650,12 +1400,6 @@
         <w:gridCol w:w="9950"/>
       </w:tblGrid>
       <w:tr>
-        <w:tblPrEx>
-          <w:tblCellMar>
-            <w:top w:w="0" w:type="dxa"/>
-            <w:bottom w:w="0" w:type="dxa"/>
-          </w:tblCellMar>
-        </w:tblPrEx>
         <w:trPr>
           <w:trHeight w:val="2100"/>
         </w:trPr>
@@ -1780,29 +1524,7 @@
           <w:sz w:val="24"/>
           <w:szCs w:val="24"/>
         </w:rPr>
-        <w:t xml:space="preserve">Laboratorio 1 — El </w:t>
-      </w:r>
-      <w:proofErr w:type="gramStart"/>
-      <w:r>
-        <w:rPr>
-          <w:b/>
-          <w:bCs/>
-          <w:color w:val="0F3D5C"/>
-          <w:sz w:val="24"/>
-          <w:szCs w:val="24"/>
-        </w:rPr>
-        <w:t>archivo .proto</w:t>
-      </w:r>
-      <w:proofErr w:type="gramEnd"/>
-      <w:r>
-        <w:rPr>
-          <w:b/>
-          <w:bCs/>
-          <w:color w:val="0F3D5C"/>
-          <w:sz w:val="24"/>
-          <w:szCs w:val="24"/>
-        </w:rPr>
-        <w:t xml:space="preserve"> como contrato</w:t>
+        <w:t>Laboratorio 1 — El archivo .proto como contrato</w:t>
       </w:r>
     </w:p>
     <w:p>
@@ -1819,23 +1541,7 @@
         <w:t xml:space="preserve">Captura N.º 3: </w:t>
       </w:r>
       <w:r>
-        <w:t xml:space="preserve">salida de </w:t>
-      </w:r>
-      <w:proofErr w:type="spellStart"/>
-      <w:r>
-        <w:t>node</w:t>
-      </w:r>
-      <w:proofErr w:type="spellEnd"/>
-      <w:r>
-        <w:t xml:space="preserve"> </w:t>
-      </w:r>
-      <w:proofErr w:type="spellStart"/>
-      <w:r>
-        <w:t>src</w:t>
-      </w:r>
-      <w:proofErr w:type="spellEnd"/>
-      <w:r>
-        <w:t>/inspeccionar.js con los tipos declarados y la ruta de los dos métodos.</w:t>
+        <w:t>salida de node src/inspeccionar.js con los tipos declarados y la ruta de los dos métodos.</w:t>
       </w:r>
     </w:p>
     <w:tbl>
@@ -1859,12 +1565,6 @@
         <w:gridCol w:w="9950"/>
       </w:tblGrid>
       <w:tr>
-        <w:tblPrEx>
-          <w:tblCellMar>
-            <w:top w:w="0" w:type="dxa"/>
-            <w:bottom w:w="0" w:type="dxa"/>
-          </w:tblCellMar>
-        </w:tblPrEx>
         <w:trPr>
           <w:trHeight w:val="2100"/>
         </w:trPr>
@@ -1947,34 +1647,7 @@
         <w:t xml:space="preserve">Captura N.º 4: </w:t>
       </w:r>
       <w:r>
-        <w:t xml:space="preserve">salida de </w:t>
-      </w:r>
-      <w:proofErr w:type="spellStart"/>
-      <w:r>
-        <w:t>node</w:t>
-      </w:r>
-      <w:proofErr w:type="spellEnd"/>
-      <w:r>
-        <w:t xml:space="preserve"> </w:t>
-      </w:r>
-      <w:proofErr w:type="spellStart"/>
-      <w:r>
-        <w:t>src</w:t>
-      </w:r>
-      <w:proofErr w:type="spellEnd"/>
-      <w:r>
-        <w:t>/bytes.js mostrando los dos ta</w:t>
-      </w:r>
-      <w:r>
-        <w:t xml:space="preserve">maños y el volcado hexadecimal del mensaje </w:t>
-      </w:r>
-      <w:proofErr w:type="spellStart"/>
-      <w:r>
-        <w:t>protobuf</w:t>
-      </w:r>
-      <w:proofErr w:type="spellEnd"/>
-      <w:r>
-        <w:t>.</w:t>
+        <w:t>salida de node src/bytes.js mostrando los dos tamaños y el volcado hexadecimal del mensaje protobuf.</w:t>
       </w:r>
     </w:p>
     <w:tbl>
@@ -1998,12 +1671,6 @@
         <w:gridCol w:w="9950"/>
       </w:tblGrid>
       <w:tr>
-        <w:tblPrEx>
-          <w:tblCellMar>
-            <w:top w:w="0" w:type="dxa"/>
-            <w:bottom w:w="0" w:type="dxa"/>
-          </w:tblCellMar>
-        </w:tblPrEx>
         <w:trPr>
           <w:trHeight w:val="2100"/>
         </w:trPr>
@@ -2077,53 +1744,20 @@
         <w:spacing w:after="80" w:line="260" w:lineRule="auto"/>
         <w:jc w:val="both"/>
       </w:pPr>
-      <w:proofErr w:type="gramStart"/>
       <w:r>
         <w:rPr>
           <w:b/>
           <w:bCs/>
           <w:color w:val="0F3D5C"/>
         </w:rPr>
-        <w:t>Pregunta N.º</w:t>
-      </w:r>
-      <w:proofErr w:type="gramEnd"/>
-      <w:r>
-        <w:rPr>
-          <w:b/>
-          <w:bCs/>
-          <w:color w:val="0F3D5C"/>
-        </w:rPr>
-        <w:t xml:space="preserve"> 2. </w:t>
+        <w:t xml:space="preserve">Pregunta N.º 2. </w:t>
       </w:r>
       <w:r>
         <w:rPr>
           <w:b/>
           <w:bCs/>
         </w:rPr>
-        <w:t>En el volcado hexadecimal no aparece ninguno de los nombres de campo, solo sus números. Enuncie dos consecuencias prácticas de ese hecho para el eq</w:t>
-      </w:r>
-      <w:r>
-        <w:rPr>
-          <w:b/>
-          <w:bCs/>
-        </w:rPr>
-        <w:t xml:space="preserve">uipo que mantiene </w:t>
-      </w:r>
-      <w:proofErr w:type="gramStart"/>
-      <w:r>
-        <w:rPr>
-          <w:b/>
-          <w:bCs/>
-        </w:rPr>
-        <w:t>el .proto</w:t>
-      </w:r>
-      <w:proofErr w:type="gramEnd"/>
-      <w:r>
-        <w:rPr>
-          <w:b/>
-          <w:bCs/>
-        </w:rPr>
-        <w:t>: una favorable y una peligrosa.</w:t>
+        <w:t>En el volcado hexadecimal no aparece ninguno de los nombres de campo, solo sus números. Enuncie dos consecuencias prácticas de ese hecho para el equipo que mantiene el .proto: una favorable y una peligrosa.</w:t>
       </w:r>
     </w:p>
     <w:tbl>
@@ -2147,12 +1781,6 @@
         <w:gridCol w:w="9746"/>
       </w:tblGrid>
       <w:tr>
-        <w:tblPrEx>
-          <w:tblCellMar>
-            <w:top w:w="0" w:type="dxa"/>
-            <w:bottom w:w="0" w:type="dxa"/>
-          </w:tblCellMar>
-        </w:tblPrEx>
         <w:trPr>
           <w:trHeight w:val="1400"/>
         </w:trPr>
@@ -2224,15 +1852,7 @@
         <w:t xml:space="preserve">Captura N.º 5: </w:t>
       </w:r>
       <w:r>
-        <w:t xml:space="preserve">la terminal con el mensaje «Servicio </w:t>
-      </w:r>
-      <w:proofErr w:type="spellStart"/>
-      <w:r>
-        <w:t>gRPC</w:t>
-      </w:r>
-      <w:proofErr w:type="spellEnd"/>
-      <w:r>
-        <w:t xml:space="preserve"> escuchando en el puerto 50051».</w:t>
+        <w:t>la terminal con el mensaje «Servicio gRPC escuchando en el puerto 50051».</w:t>
       </w:r>
     </w:p>
     <w:tbl>
@@ -2256,12 +1876,6 @@
         <w:gridCol w:w="9950"/>
       </w:tblGrid>
       <w:tr>
-        <w:tblPrEx>
-          <w:tblCellMar>
-            <w:top w:w="0" w:type="dxa"/>
-            <w:bottom w:w="0" w:type="dxa"/>
-          </w:tblCellMar>
-        </w:tblPrEx>
         <w:trPr>
           <w:trHeight w:val="2100"/>
         </w:trPr>
@@ -2344,15 +1958,7 @@
         <w:t xml:space="preserve">Captura N.º 6: </w:t>
       </w:r>
       <w:r>
-        <w:t xml:space="preserve">las dos llamadas de </w:t>
-      </w:r>
-      <w:proofErr w:type="spellStart"/>
-      <w:r>
-        <w:t>grpcurl</w:t>
-      </w:r>
-      <w:proofErr w:type="spellEnd"/>
-      <w:r>
-        <w:t xml:space="preserve"> con sus respuestas en la segunda terminal.</w:t>
+        <w:t>las dos llamadas de grpcurl con sus respuestas en la segunda terminal.</w:t>
       </w:r>
     </w:p>
     <w:tbl>
@@ -2376,12 +1982,6 @@
         <w:gridCol w:w="9950"/>
       </w:tblGrid>
       <w:tr>
-        <w:tblPrEx>
-          <w:tblCellMar>
-            <w:top w:w="0" w:type="dxa"/>
-            <w:bottom w:w="0" w:type="dxa"/>
-          </w:tblCellMar>
-        </w:tblPrEx>
         <w:trPr>
           <w:trHeight w:val="2100"/>
         </w:trPr>
@@ -2515,46 +2115,7 @@
           <w:b/>
           <w:bCs/>
         </w:rPr>
-        <w:t xml:space="preserve">A la API REST de la Práctica 3 le pudo hablar con </w:t>
-      </w:r>
-      <w:proofErr w:type="spellStart"/>
-      <w:r>
-        <w:rPr>
-          <w:b/>
-          <w:bCs/>
-        </w:rPr>
-        <w:t>curl</w:t>
-      </w:r>
-      <w:proofErr w:type="spellEnd"/>
-      <w:r>
-        <w:rPr>
-          <w:b/>
-          <w:bCs/>
-        </w:rPr>
-        <w:t xml:space="preserve"> sin darle ningún archivo adicional; a este servicio hay que pasarle </w:t>
-      </w:r>
-      <w:proofErr w:type="gramStart"/>
-      <w:r>
-        <w:rPr>
-          <w:b/>
-          <w:bCs/>
-        </w:rPr>
-        <w:t>el .pr</w:t>
-      </w:r>
-      <w:r>
-        <w:rPr>
-          <w:b/>
-          <w:bCs/>
-        </w:rPr>
-        <w:t>oto</w:t>
-      </w:r>
-      <w:proofErr w:type="gramEnd"/>
-      <w:r>
-        <w:rPr>
-          <w:b/>
-          <w:bCs/>
-        </w:rPr>
-        <w:t>. Explique a qué se debe esa diferencia y qué gana y qué pierde un equipo por ella.</w:t>
+        <w:t>A la API REST de la Práctica 3 le pudo hablar con curl sin darle ningún archivo adicional; a este servicio hay que pasarle el .proto. Explique a qué se debe esa diferencia y qué gana y qué pierde un equipo por ella.</w:t>
       </w:r>
     </w:p>
     <w:tbl>
@@ -2578,12 +2139,6 @@
         <w:gridCol w:w="9746"/>
       </w:tblGrid>
       <w:tr>
-        <w:tblPrEx>
-          <w:tblCellMar>
-            <w:top w:w="0" w:type="dxa"/>
-            <w:bottom w:w="0" w:type="dxa"/>
-          </w:tblCellMar>
-        </w:tblPrEx>
         <w:trPr>
           <w:trHeight w:val="1400"/>
         </w:trPr>
@@ -2603,10 +2158,7 @@
               <w:pStyle w:val="NormalWeb"/>
             </w:pPr>
             <w:r>
-              <w:t>Gana r</w:t>
-            </w:r>
-            <w:r>
-              <w:t>endimiento extremo y contratos estrictos que evitan ambigüedades.</w:t>
+              <w:t>Gana rendimiento extremo y contratos estrictos que evitan ambigüedades.</w:t>
             </w:r>
           </w:p>
           <w:p>
@@ -2614,30 +2166,7 @@
               <w:pStyle w:val="NormalWeb"/>
             </w:pPr>
             <w:r>
-              <w:t>Pierde</w:t>
-            </w:r>
-            <w:r>
-              <w:t xml:space="preserve"> </w:t>
-            </w:r>
-            <w:r>
-              <w:t>f</w:t>
-            </w:r>
-            <w:r>
-              <w:t xml:space="preserve">acilidad de prueba y agilidad, ya que siempre se requiere obligatoriamente el </w:t>
-            </w:r>
-            <w:proofErr w:type="gramStart"/>
-            <w:r>
-              <w:t>archiv</w:t>
-            </w:r>
-            <w:r>
-              <w:t>o .proto</w:t>
-            </w:r>
-            <w:proofErr w:type="gramEnd"/>
-            <w:r>
-              <w:t xml:space="preserve"> </w:t>
-            </w:r>
-            <w:r>
-              <w:t>compilado para entender qué significan los bytes.</w:t>
+              <w:t>Pierde facilidad de prueba y agilidad, ya que siempre se requiere obligatoriamente el archivo .proto compilado para entender qué significan los bytes.</w:t>
             </w:r>
           </w:p>
           <w:p/>
@@ -2664,20 +2193,8 @@
           <w:sz w:val="24"/>
           <w:szCs w:val="24"/>
         </w:rPr>
-        <w:t xml:space="preserve">Laboratorio 3 — El cliente y los códigos de estado de </w:t>
-      </w:r>
-      <w:proofErr w:type="spellStart"/>
-      <w:r>
-        <w:rPr>
-          <w:b/>
-          <w:bCs/>
-          <w:color w:val="0F3D5C"/>
-          <w:sz w:val="24"/>
-          <w:szCs w:val="24"/>
-        </w:rPr>
-        <w:t>gRPC</w:t>
-      </w:r>
-      <w:proofErr w:type="spellEnd"/>
+        <w:t>Laboratorio 3 — El cliente y los códigos de estado de gRPC</w:t>
+      </w:r>
     </w:p>
     <w:p>
       <w:pPr>
@@ -2693,23 +2210,7 @@
         <w:t xml:space="preserve">Captura N.º 7: </w:t>
       </w:r>
       <w:r>
-        <w:t xml:space="preserve">salida de </w:t>
-      </w:r>
-      <w:proofErr w:type="spellStart"/>
-      <w:r>
-        <w:t>node</w:t>
-      </w:r>
-      <w:proofErr w:type="spellEnd"/>
-      <w:r>
-        <w:t xml:space="preserve"> </w:t>
-      </w:r>
-      <w:proofErr w:type="spellStart"/>
-      <w:r>
-        <w:t>src</w:t>
-      </w:r>
-      <w:proofErr w:type="spellEnd"/>
-      <w:r>
-        <w:t>/cliente.js con el estudiante agregado y luego obtenido.</w:t>
+        <w:t>salida de node src/cliente.js con el estudiante agregado y luego obtenido.</w:t>
       </w:r>
     </w:p>
     <w:tbl>
@@ -2733,12 +2234,6 @@
         <w:gridCol w:w="9950"/>
       </w:tblGrid>
       <w:tr>
-        <w:tblPrEx>
-          <w:tblCellMar>
-            <w:top w:w="0" w:type="dxa"/>
-            <w:bottom w:w="0" w:type="dxa"/>
-          </w:tblCellMar>
-        </w:tblPrEx>
         <w:trPr>
           <w:trHeight w:val="2100"/>
         </w:trPr>
@@ -2846,12 +2341,6 @@
         <w:gridCol w:w="9950"/>
       </w:tblGrid>
       <w:tr>
-        <w:tblPrEx>
-          <w:tblCellMar>
-            <w:top w:w="0" w:type="dxa"/>
-            <w:bottom w:w="0" w:type="dxa"/>
-          </w:tblCellMar>
-        </w:tblPrEx>
         <w:trPr>
           <w:trHeight w:val="2100"/>
         </w:trPr>
@@ -2925,37 +2414,20 @@
         <w:spacing w:after="80" w:line="260" w:lineRule="auto"/>
         <w:jc w:val="both"/>
       </w:pPr>
-      <w:proofErr w:type="gramStart"/>
       <w:r>
         <w:rPr>
           <w:b/>
           <w:bCs/>
           <w:color w:val="0F3D5C"/>
         </w:rPr>
-        <w:t>Pregunta N.º</w:t>
-      </w:r>
-      <w:proofErr w:type="gramEnd"/>
-      <w:r>
-        <w:rPr>
-          <w:b/>
-          <w:bCs/>
-          <w:color w:val="0F3D5C"/>
-        </w:rPr>
-        <w:t xml:space="preserve"> 4. </w:t>
+        <w:t xml:space="preserve">Pregunta N.º 4. </w:t>
       </w:r>
       <w:r>
         <w:rPr>
           <w:b/>
           <w:bCs/>
         </w:rPr>
-        <w:t>Su servicio A llama a su servicio B y recibe un error. Explique por qué la decisión de reintentar la llamada no puede ser la misma si el código es UNAVAILABLE (14) que si es DEADLINE_EXCEEDED (4). Use un ejemplo de su proyecto integrador en el que reintent</w:t>
-      </w:r>
-      <w:r>
-        <w:rPr>
-          <w:b/>
-          <w:bCs/>
-        </w:rPr>
-        <w:t>ar por error causaría un daño real.</w:t>
+        <w:t>Su servicio A llama a su servicio B y recibe un error. Explique por qué la decisión de reintentar la llamada no puede ser la misma si el código es UNAVAILABLE (14) que si es DEADLINE_EXCEEDED (4). Use un ejemplo de su proyecto integrador en el que reintentar por error causaría un daño real.</w:t>
       </w:r>
     </w:p>
     <w:tbl>
@@ -2979,12 +2451,6 @@
         <w:gridCol w:w="9746"/>
       </w:tblGrid>
       <w:tr>
-        <w:tblPrEx>
-          <w:tblCellMar>
-            <w:top w:w="0" w:type="dxa"/>
-            <w:bottom w:w="0" w:type="dxa"/>
-          </w:tblCellMar>
-        </w:tblPrEx>
         <w:trPr>
           <w:trHeight w:val="1400"/>
         </w:trPr>
@@ -3031,23 +2497,7 @@
         <w:t xml:space="preserve">Captura N.º 9: </w:t>
       </w:r>
       <w:r>
-        <w:t xml:space="preserve">las dos llamadas fallidas mostrando los códigos </w:t>
-      </w:r>
-      <w:proofErr w:type="spellStart"/>
-      <w:r>
-        <w:t>Unimplemented</w:t>
-      </w:r>
-      <w:proofErr w:type="spellEnd"/>
-      <w:r>
-        <w:t xml:space="preserve"> y </w:t>
-      </w:r>
-      <w:proofErr w:type="spellStart"/>
-      <w:r>
-        <w:t>DeadlineExceeded</w:t>
-      </w:r>
-      <w:proofErr w:type="spellEnd"/>
-      <w:r>
-        <w:t>.</w:t>
+        <w:t>las dos llamadas fallidas mostrando los códigos Unimplemented y DeadlineExceeded.</w:t>
       </w:r>
     </w:p>
     <w:tbl>
@@ -3071,12 +2521,6 @@
         <w:gridCol w:w="9950"/>
       </w:tblGrid>
       <w:tr>
-        <w:tblPrEx>
-          <w:tblCellMar>
-            <w:top w:w="0" w:type="dxa"/>
-            <w:bottom w:w="0" w:type="dxa"/>
-          </w:tblCellMar>
-        </w:tblPrEx>
         <w:trPr>
           <w:trHeight w:val="2100"/>
         </w:trPr>
@@ -3161,29 +2605,7 @@
           <w:sz w:val="24"/>
           <w:szCs w:val="24"/>
         </w:rPr>
-        <w:t xml:space="preserve">Laboratorio 4 — </w:t>
-      </w:r>
-      <w:proofErr w:type="spellStart"/>
-      <w:r>
-        <w:rPr>
-          <w:b/>
-          <w:bCs/>
-          <w:color w:val="0F3D5C"/>
-          <w:sz w:val="24"/>
-          <w:szCs w:val="24"/>
-        </w:rPr>
-        <w:t>Streaming</w:t>
-      </w:r>
-      <w:proofErr w:type="spellEnd"/>
-      <w:r>
-        <w:rPr>
-          <w:b/>
-          <w:bCs/>
-          <w:color w:val="0F3D5C"/>
-          <w:sz w:val="24"/>
-          <w:szCs w:val="24"/>
-        </w:rPr>
-        <w:t>: cuando una sola respuesta no alcanza</w:t>
+        <w:t>Laboratorio 4 — Streaming: cuando una sola respuesta no alcanza</w:t>
       </w:r>
     </w:p>
     <w:p>
@@ -3200,23 +2622,7 @@
         <w:t xml:space="preserve">Captura N.º 10: </w:t>
       </w:r>
       <w:r>
-        <w:t xml:space="preserve">salida de </w:t>
-      </w:r>
-      <w:proofErr w:type="spellStart"/>
-      <w:r>
-        <w:t>node</w:t>
-      </w:r>
-      <w:proofErr w:type="spellEnd"/>
-      <w:r>
-        <w:t xml:space="preserve"> </w:t>
-      </w:r>
-      <w:proofErr w:type="spellStart"/>
-      <w:r>
-        <w:t>src</w:t>
-      </w:r>
-      <w:proofErr w:type="spellEnd"/>
-      <w:r>
-        <w:t>/listar.js mostrando el estudiante recibido por el flujo y el mensaje «fin del flujo».</w:t>
+        <w:t>salida de node src/listar.js mostrando el estudiante recibido por el flujo y el mensaje «fin del flujo».</w:t>
       </w:r>
     </w:p>
     <w:tbl>
@@ -3240,12 +2646,6 @@
         <w:gridCol w:w="9950"/>
       </w:tblGrid>
       <w:tr>
-        <w:tblPrEx>
-          <w:tblCellMar>
-            <w:top w:w="0" w:type="dxa"/>
-            <w:bottom w:w="0" w:type="dxa"/>
-          </w:tblCellMar>
-        </w:tblPrEx>
         <w:trPr>
           <w:trHeight w:val="2100"/>
         </w:trPr>
@@ -3368,23 +2768,7 @@
         <w:t xml:space="preserve">Captura N.º 11: </w:t>
       </w:r>
       <w:r>
-        <w:t xml:space="preserve">salida de </w:t>
-      </w:r>
-      <w:proofErr w:type="spellStart"/>
-      <w:r>
-        <w:t>node</w:t>
-      </w:r>
-      <w:proofErr w:type="spellEnd"/>
-      <w:r>
-        <w:t xml:space="preserve"> </w:t>
-      </w:r>
-      <w:proofErr w:type="spellStart"/>
-      <w:r>
-        <w:t>src</w:t>
-      </w:r>
-      <w:proofErr w:type="spellEnd"/>
-      <w:r>
-        <w:t>/listar.js Sistemas con los tiempos del primer y del último estudiante recibidos.</w:t>
+        <w:t>salida de node src/listar.js Sistemas con los tiempos del primer y del último estudiante recibidos.</w:t>
       </w:r>
     </w:p>
     <w:tbl>
@@ -3408,12 +2792,6 @@
         <w:gridCol w:w="9950"/>
       </w:tblGrid>
       <w:tr>
-        <w:tblPrEx>
-          <w:tblCellMar>
-            <w:top w:w="0" w:type="dxa"/>
-            <w:bottom w:w="0" w:type="dxa"/>
-          </w:tblCellMar>
-        </w:tblPrEx>
         <w:trPr>
           <w:trHeight w:val="2100"/>
         </w:trPr>
@@ -3488,37 +2866,20 @@
         <w:spacing w:after="80" w:line="260" w:lineRule="auto"/>
         <w:jc w:val="both"/>
       </w:pPr>
-      <w:proofErr w:type="gramStart"/>
       <w:r>
         <w:rPr>
           <w:b/>
           <w:bCs/>
           <w:color w:val="0F3D5C"/>
         </w:rPr>
-        <w:t>Pregunta N.º</w:t>
-      </w:r>
-      <w:proofErr w:type="gramEnd"/>
-      <w:r>
-        <w:rPr>
-          <w:b/>
-          <w:bCs/>
-          <w:color w:val="0F3D5C"/>
-        </w:rPr>
-        <w:t xml:space="preserve"> 5. </w:t>
+        <w:t xml:space="preserve">Pregunta N.º 5. </w:t>
       </w:r>
       <w:r>
         <w:rPr>
           <w:b/>
           <w:bCs/>
         </w:rPr>
-        <w:t>Describa una operación de su proyecto integrador en la que el flujo del servidor sería una mejora real frente a dev</w:t>
-      </w:r>
-      <w:r>
-        <w:rPr>
-          <w:b/>
-          <w:bCs/>
-        </w:rPr>
-        <w:t>olver el arreglo completo, y otra en la que sería una complicación sin beneficio. Justifique cada caso con el volumen de datos y con lo que el cliente hace mientras espera.</w:t>
+        <w:t>Describa una operación de su proyecto integrador en la que el flujo del servidor sería una mejora real frente a devolver el arreglo completo, y otra en la que sería una complicación sin beneficio. Justifique cada caso con el volumen de datos y con lo que el cliente hace mientras espera.</w:t>
       </w:r>
     </w:p>
     <w:tbl>
@@ -3542,12 +2903,6 @@
         <w:gridCol w:w="9746"/>
       </w:tblGrid>
       <w:tr>
-        <w:tblPrEx>
-          <w:tblCellMar>
-            <w:top w:w="0" w:type="dxa"/>
-            <w:bottom w:w="0" w:type="dxa"/>
-          </w:tblCellMar>
-        </w:tblPrEx>
         <w:trPr>
           <w:trHeight w:val="1400"/>
         </w:trPr>
@@ -3564,45 +2919,17 @@
           </w:tcPr>
           <w:p>
             <w:r>
-              <w:t xml:space="preserve">Mejorar: </w:t>
-            </w:r>
-            <w:r>
-              <w:t xml:space="preserve">Consultar logs masivos o auditorías del sistema; el cliente procesa los datos progresivamente vía </w:t>
-            </w:r>
-            <w:proofErr w:type="spellStart"/>
-            <w:r>
-              <w:t>streaming</w:t>
-            </w:r>
-            <w:proofErr w:type="spellEnd"/>
-            <w:r>
-              <w:t xml:space="preserve"> sin colapsar su memoria RAM mientras espera.</w:t>
-            </w:r>
-          </w:p>
-          <w:p>
-            <w:r>
-              <w:t>Complicación. O</w:t>
-            </w:r>
-            <w:r>
-              <w:t xml:space="preserve">btener los datos de un solo usuario por su ID; el volumen es mínimo, llega en una sola respuesta instantánea y el </w:t>
-            </w:r>
-            <w:proofErr w:type="spellStart"/>
-            <w:r>
-              <w:t>streaming</w:t>
-            </w:r>
-            <w:proofErr w:type="spellEnd"/>
-            <w:r>
-              <w:t xml:space="preserve"> solo agrega complejidad de código innecesaria.</w:t>
+              <w:t>Mejorar: Consultar logs masivos o auditorías del sistema; el cliente procesa los datos progresivamente vía streaming sin colapsar su memoria RAM mientras espera.</w:t>
+            </w:r>
+          </w:p>
+          <w:p>
+            <w:r>
+              <w:t>Complicación. Obtener los datos de un solo usuario por su ID; el volumen es mínimo, llega en una sola respuesta instantánea y el streaming solo agrega complejidad de código innecesaria.</w:t>
             </w:r>
           </w:p>
         </w:tc>
       </w:tr>
       <w:tr>
-        <w:tblPrEx>
-          <w:tblCellMar>
-            <w:top w:w="0" w:type="dxa"/>
-            <w:bottom w:w="0" w:type="dxa"/>
-          </w:tblCellMar>
-        </w:tblPrEx>
         <w:trPr>
           <w:trHeight w:val="1400"/>
         </w:trPr>
@@ -3682,12 +3009,6 @@
         <w:gridCol w:w="9950"/>
       </w:tblGrid>
       <w:tr>
-        <w:tblPrEx>
-          <w:tblCellMar>
-            <w:top w:w="0" w:type="dxa"/>
-            <w:bottom w:w="0" w:type="dxa"/>
-          </w:tblCellMar>
-        </w:tblPrEx>
         <w:trPr>
           <w:trHeight w:val="2100"/>
         </w:trPr>
@@ -3794,12 +3115,6 @@
         <w:gridCol w:w="9950"/>
       </w:tblGrid>
       <w:tr>
-        <w:tblPrEx>
-          <w:tblCellMar>
-            <w:top w:w="0" w:type="dxa"/>
-            <w:bottom w:w="0" w:type="dxa"/>
-          </w:tblCellMar>
-        </w:tblPrEx>
         <w:trPr>
           <w:trHeight w:val="2100"/>
         </w:trPr>
@@ -3882,37 +3197,20 @@
         <w:spacing w:after="80" w:line="260" w:lineRule="auto"/>
         <w:jc w:val="both"/>
       </w:pPr>
-      <w:proofErr w:type="gramStart"/>
       <w:r>
         <w:rPr>
           <w:b/>
           <w:bCs/>
           <w:color w:val="0F3D5C"/>
         </w:rPr>
-        <w:t>Pregunta N.º</w:t>
-      </w:r>
-      <w:proofErr w:type="gramEnd"/>
-      <w:r>
-        <w:rPr>
-          <w:b/>
-          <w:bCs/>
-          <w:color w:val="0F3D5C"/>
-        </w:rPr>
-        <w:t xml:space="preserve"> 6. </w:t>
+        <w:t xml:space="preserve">Pregunta N.º 6. </w:t>
       </w:r>
       <w:r>
         <w:rPr>
           <w:b/>
           <w:bCs/>
         </w:rPr>
-        <w:t xml:space="preserve">Este cambio no produjo ningún error: produjo un dato incorrecto que parece </w:t>
-      </w:r>
-      <w:r>
-        <w:rPr>
-          <w:b/>
-          <w:bCs/>
-        </w:rPr>
-        <w:t>correcto. Compárelo con lo que habría pasado en la API REST de la Práctica 3 si alguien renombra un campo del JSON. ¿Cuál de las dos fallas es más fácil de detectar y por qué?</w:t>
+        <w:t>Este cambio no produjo ningún error: produjo un dato incorrecto que parece correcto. Compárelo con lo que habría pasado en la API REST de la Práctica 3 si alguien renombra un campo del JSON. ¿Cuál de las dos fallas es más fácil de detectar y por qué?</w:t>
       </w:r>
     </w:p>
     <w:tbl>
@@ -3936,12 +3234,6 @@
         <w:gridCol w:w="9746"/>
       </w:tblGrid>
       <w:tr>
-        <w:tblPrEx>
-          <w:tblCellMar>
-            <w:top w:w="0" w:type="dxa"/>
-            <w:bottom w:w="0" w:type="dxa"/>
-          </w:tblCellMar>
-        </w:tblPrEx>
         <w:trPr>
           <w:trHeight w:val="1400"/>
         </w:trPr>
@@ -3958,34 +3250,13 @@
           </w:tcPr>
           <w:p>
             <w:r>
-              <w:t xml:space="preserve">En REST (JSON), renombrar un campo rompe el contrato y la aplicación arroja un error inmediato de </w:t>
-            </w:r>
-            <w:proofErr w:type="spellStart"/>
-            <w:r>
-              <w:t>undefine</w:t>
+              <w:t>En REST (JSON), renombrar un campo rompe el contrato y la aplicación arroja un error inmediato de undefine</w:t>
             </w:r>
             <w:r>
               <w:t>d</w:t>
             </w:r>
-            <w:proofErr w:type="spellEnd"/>
-            <w:r>
-              <w:t xml:space="preserve">, volviéndose evidente de inmediato. En </w:t>
-            </w:r>
-            <w:proofErr w:type="spellStart"/>
-            <w:r>
-              <w:t>gRPC</w:t>
-            </w:r>
-            <w:proofErr w:type="spellEnd"/>
-            <w:r>
-              <w:t xml:space="preserve">, cambiar el </w:t>
-            </w:r>
-            <w:proofErr w:type="gramStart"/>
-            <w:r>
-              <w:t>nombre</w:t>
-            </w:r>
-            <w:proofErr w:type="gramEnd"/>
-            <w:r>
-              <w:t xml:space="preserve"> pero mantener el número pasa desapercibido porque solo importan las posiciones binarias</w:t>
+            <w:r>
+              <w:t>, volviéndose evidente de inmediato. En gRPC, cambiar el nombre pero mantener el número pasa desapercibido porque solo importan las posiciones binarias</w:t>
             </w:r>
           </w:p>
         </w:tc>
@@ -4010,15 +3281,7 @@
         <w:t xml:space="preserve">Captura N.º 14: </w:t>
       </w:r>
       <w:r>
-        <w:t xml:space="preserve">el error de carga </w:t>
-      </w:r>
-      <w:proofErr w:type="gramStart"/>
-      <w:r>
-        <w:t>del .proto</w:t>
-      </w:r>
-      <w:proofErr w:type="gramEnd"/>
-      <w:r>
-        <w:t xml:space="preserve"> al intentar reutilizar un número reservado, y el arranque correcto una vez corregido.</w:t>
+        <w:t>el error de carga del .proto al intentar reutilizar un número reservado, y el arranque correcto una vez corregido.</w:t>
       </w:r>
     </w:p>
     <w:tbl>
@@ -4042,12 +3305,6 @@
         <w:gridCol w:w="9950"/>
       </w:tblGrid>
       <w:tr>
-        <w:tblPrEx>
-          <w:tblCellMar>
-            <w:top w:w="0" w:type="dxa"/>
-            <w:bottom w:w="0" w:type="dxa"/>
-          </w:tblCellMar>
-        </w:tblPrEx>
         <w:trPr>
           <w:trHeight w:val="2100"/>
         </w:trPr>
@@ -4161,23 +3418,13 @@
         <w:spacing w:after="80" w:line="260" w:lineRule="auto"/>
         <w:jc w:val="both"/>
       </w:pPr>
-      <w:proofErr w:type="gramStart"/>
       <w:r>
         <w:rPr>
           <w:b/>
           <w:bCs/>
           <w:color w:val="0F3D5C"/>
         </w:rPr>
-        <w:t>Pregunta N.º</w:t>
-      </w:r>
-      <w:proofErr w:type="gramEnd"/>
-      <w:r>
-        <w:rPr>
-          <w:b/>
-          <w:bCs/>
-          <w:color w:val="0F3D5C"/>
-        </w:rPr>
-        <w:t xml:space="preserve"> 7. </w:t>
+        <w:t xml:space="preserve">Pregunta N.º 7. </w:t>
       </w:r>
       <w:r>
         <w:rPr>
@@ -4208,12 +3455,6 @@
         <w:gridCol w:w="9746"/>
       </w:tblGrid>
       <w:tr>
-        <w:tblPrEx>
-          <w:tblCellMar>
-            <w:top w:w="0" w:type="dxa"/>
-            <w:bottom w:w="0" w:type="dxa"/>
-          </w:tblCellMar>
-        </w:tblPrEx>
         <w:trPr>
           <w:trHeight w:val="1400"/>
         </w:trPr>
@@ -4231,15 +3472,7 @@
           <w:p>
             <w:r>
               <w:lastRenderedPageBreak/>
-              <w:t xml:space="preserve">Los números de campo y nombres en los </w:t>
-            </w:r>
-            <w:proofErr w:type="gramStart"/>
-            <w:r>
-              <w:t>archivos .proto</w:t>
-            </w:r>
-            <w:proofErr w:type="gramEnd"/>
-            <w:r>
-              <w:t xml:space="preserve"> jamás se reutilizan ni se modifican; ante un cambio, se deprecian y se asigna un tag nuevo</w:t>
+              <w:t>Los números de campo y nombres en los archivos .proto jamás se reutilizan ni se modifican; ante un cambio, se deprecian y se asigna un tag nuevo</w:t>
             </w:r>
           </w:p>
         </w:tc>
@@ -4265,17 +3498,7 @@
           <w:sz w:val="24"/>
           <w:szCs w:val="24"/>
         </w:rPr>
-        <w:t>Laboratori</w:t>
-      </w:r>
-      <w:r>
-        <w:rPr>
-          <w:b/>
-          <w:bCs/>
-          <w:color w:val="0F3D5C"/>
-          <w:sz w:val="24"/>
-          <w:szCs w:val="24"/>
-        </w:rPr>
-        <w:t>o 6 — Medir contra REST y empaquetar en la red de Docker</w:t>
+        <w:t>Laboratorio 6 — Medir contra REST y empaquetar en la red de Docker</w:t>
       </w:r>
     </w:p>
     <w:p>
@@ -4292,15 +3515,7 @@
         <w:t xml:space="preserve">Captura N.º 15: </w:t>
       </w:r>
       <w:r>
-        <w:t xml:space="preserve">las mediciones con </w:t>
-      </w:r>
-      <w:proofErr w:type="spellStart"/>
-      <w:r>
-        <w:t>curl</w:t>
-      </w:r>
-      <w:proofErr w:type="spellEnd"/>
-      <w:r>
-        <w:t xml:space="preserve"> del servicio REST, con el tamaño en bytes y el tiempo de cada llamada.</w:t>
+        <w:t>las mediciones con curl del servicio REST, con el tamaño en bytes y el tiempo de cada llamada.</w:t>
       </w:r>
     </w:p>
     <w:tbl>
@@ -4324,12 +3539,6 @@
         <w:gridCol w:w="9950"/>
       </w:tblGrid>
       <w:tr>
-        <w:tblPrEx>
-          <w:tblCellMar>
-            <w:top w:w="0" w:type="dxa"/>
-            <w:bottom w:w="0" w:type="dxa"/>
-          </w:tblCellMar>
-        </w:tblPrEx>
         <w:trPr>
           <w:trHeight w:val="2100"/>
         </w:trPr>
@@ -4412,23 +3621,7 @@
         <w:t xml:space="preserve">Captura N.º 16: </w:t>
       </w:r>
       <w:r>
-        <w:t xml:space="preserve">salida de </w:t>
-      </w:r>
-      <w:proofErr w:type="spellStart"/>
-      <w:r>
-        <w:t>node</w:t>
-      </w:r>
-      <w:proofErr w:type="spellEnd"/>
-      <w:r>
-        <w:t xml:space="preserve"> </w:t>
-      </w:r>
-      <w:proofErr w:type="spellStart"/>
-      <w:r>
-        <w:t>src</w:t>
-      </w:r>
-      <w:proofErr w:type="spellEnd"/>
-      <w:r>
-        <w:t>/medir.js con el promedio de las diez llamadas y los dos tamaños de la respuesta.</w:t>
+        <w:t>salida de node src/medir.js con el promedio de las diez llamadas y los dos tamaños de la respuesta.</w:t>
       </w:r>
     </w:p>
     <w:tbl>
@@ -4452,12 +3645,6 @@
         <w:gridCol w:w="9950"/>
       </w:tblGrid>
       <w:tr>
-        <w:tblPrEx>
-          <w:tblCellMar>
-            <w:top w:w="0" w:type="dxa"/>
-            <w:bottom w:w="0" w:type="dxa"/>
-          </w:tblCellMar>
-        </w:tblPrEx>
         <w:trPr>
           <w:trHeight w:val="2100"/>
         </w:trPr>
@@ -4564,12 +3751,6 @@
         <w:gridCol w:w="9950"/>
       </w:tblGrid>
       <w:tr>
-        <w:tblPrEx>
-          <w:tblCellMar>
-            <w:top w:w="0" w:type="dxa"/>
-            <w:bottom w:w="0" w:type="dxa"/>
-          </w:tblCellMar>
-        </w:tblPrEx>
         <w:trPr>
           <w:trHeight w:val="2100"/>
         </w:trPr>
@@ -4644,53 +3825,20 @@
         <w:spacing w:after="80" w:line="260" w:lineRule="auto"/>
         <w:jc w:val="both"/>
       </w:pPr>
-      <w:proofErr w:type="gramStart"/>
       <w:r>
         <w:rPr>
           <w:b/>
           <w:bCs/>
           <w:color w:val="0F3D5C"/>
         </w:rPr>
-        <w:t>Pregunta N.º</w:t>
-      </w:r>
-      <w:proofErr w:type="gramEnd"/>
-      <w:r>
-        <w:rPr>
-          <w:b/>
-          <w:bCs/>
-          <w:color w:val="0F3D5C"/>
-        </w:rPr>
-        <w:t xml:space="preserve"> 8. </w:t>
+        <w:t xml:space="preserve">Pregunta N.º 8. </w:t>
       </w:r>
       <w:r>
         <w:rPr>
           <w:b/>
           <w:bCs/>
         </w:rPr>
-        <w:t xml:space="preserve">Con sus tres columnas a la vista: ¿por qué sería un error exponer este servicio </w:t>
-      </w:r>
-      <w:proofErr w:type="spellStart"/>
-      <w:r>
-        <w:rPr>
-          <w:b/>
-          <w:bCs/>
-        </w:rPr>
-        <w:t>gRPC</w:t>
-      </w:r>
-      <w:proofErr w:type="spellEnd"/>
-      <w:r>
-        <w:rPr>
-          <w:b/>
-          <w:bCs/>
-        </w:rPr>
-        <w:t xml:space="preserve"> directamente al navegador de un usuario final, aunque sea el más rápido de los tres? Y a la inversa: ¿por qué sería un error q</w:t>
-      </w:r>
-      <w:r>
-        <w:rPr>
-          <w:b/>
-          <w:bCs/>
-        </w:rPr>
-        <w:t>ue sus servicios internos se hablen entre ellos por REST si ya tienen este contrato?</w:t>
+        <w:t>Con sus tres columnas a la vista: ¿por qué sería un error exponer este servicio gRPC directamente al navegador de un usuario final, aunque sea el más rápido de los tres? Y a la inversa: ¿por qué sería un error que sus servicios internos se hablen entre ellos por REST si ya tienen este contrato?</w:t>
       </w:r>
     </w:p>
     <w:tbl>
@@ -4714,12 +3862,6 @@
         <w:gridCol w:w="9746"/>
       </w:tblGrid>
       <w:tr>
-        <w:tblPrEx>
-          <w:tblCellMar>
-            <w:top w:w="0" w:type="dxa"/>
-            <w:bottom w:w="0" w:type="dxa"/>
-          </w:tblCellMar>
-        </w:tblPrEx>
         <w:trPr>
           <w:trHeight w:val="1400"/>
         </w:trPr>
@@ -4736,31 +3878,7 @@
           </w:tcPr>
           <w:p>
             <w:r>
-              <w:t xml:space="preserve">Exponer </w:t>
-            </w:r>
-            <w:proofErr w:type="spellStart"/>
-            <w:r>
-              <w:t>gRPC</w:t>
-            </w:r>
-            <w:proofErr w:type="spellEnd"/>
-            <w:r>
-              <w:t xml:space="preserve"> al navegador es un error porque los navegadores actuales no soportan nativamente HTTP/2 completo ni la manipulación de tramas binarias de </w:t>
-            </w:r>
-            <w:proofErr w:type="spellStart"/>
-            <w:r>
-              <w:t>gRPC</w:t>
-            </w:r>
-            <w:proofErr w:type="spellEnd"/>
-            <w:r>
-              <w:t xml:space="preserve"> sin </w:t>
-            </w:r>
-            <w:proofErr w:type="spellStart"/>
-            <w:r>
-              <w:t>proxies</w:t>
-            </w:r>
-            <w:proofErr w:type="spellEnd"/>
-            <w:r>
-              <w:t xml:space="preserve"> pesados</w:t>
+              <w:t>Exponer gRPC al navegador es un error porque los navegadores actuales no soportan nativamente HTTP/2 completo ni la manipulación de tramas binarias de gRPC sin proxies pesados</w:t>
             </w:r>
           </w:p>
         </w:tc>
@@ -4785,47 +3903,7 @@
         <w:t xml:space="preserve">Captura N.º 18: </w:t>
       </w:r>
       <w:r>
-        <w:t xml:space="preserve">la respuesta de </w:t>
-      </w:r>
-      <w:proofErr w:type="spellStart"/>
-      <w:r>
-        <w:t>curl</w:t>
-      </w:r>
-      <w:proofErr w:type="spellEnd"/>
-      <w:r>
-        <w:t xml:space="preserve"> al servicio REST devolviendo datos que vinieron por </w:t>
-      </w:r>
-      <w:proofErr w:type="spellStart"/>
-      <w:r>
-        <w:t>gRPC</w:t>
-      </w:r>
-      <w:proofErr w:type="spellEnd"/>
-      <w:r>
-        <w:t xml:space="preserve">, junto a la salida de </w:t>
-      </w:r>
-      <w:proofErr w:type="spellStart"/>
-      <w:r>
-        <w:t>docker</w:t>
-      </w:r>
-      <w:proofErr w:type="spellEnd"/>
-      <w:r>
-        <w:t xml:space="preserve"> </w:t>
-      </w:r>
-      <w:proofErr w:type="spellStart"/>
-      <w:r>
-        <w:t>compose</w:t>
-      </w:r>
-      <w:proofErr w:type="spellEnd"/>
-      <w:r>
-        <w:t xml:space="preserve"> </w:t>
-      </w:r>
-      <w:proofErr w:type="spellStart"/>
-      <w:r>
-        <w:t>ps</w:t>
-      </w:r>
-      <w:proofErr w:type="spellEnd"/>
-      <w:r>
-        <w:t xml:space="preserve"> con los dos contenedores.</w:t>
+        <w:t>la respuesta de curl al servicio REST devolviendo datos que vinieron por gRPC, junto a la salida de docker compose ps con los dos contenedores.</w:t>
       </w:r>
     </w:p>
     <w:tbl>
@@ -4849,12 +3927,6 @@
         <w:gridCol w:w="9950"/>
       </w:tblGrid>
       <w:tr>
-        <w:tblPrEx>
-          <w:tblCellMar>
-            <w:top w:w="0" w:type="dxa"/>
-            <w:bottom w:w="0" w:type="dxa"/>
-          </w:tblCellMar>
-        </w:tblPrEx>
         <w:trPr>
           <w:trHeight w:val="2100"/>
         </w:trPr>
@@ -4938,23 +4010,7 @@
         <w:t xml:space="preserve">Captura N.º 19: </w:t>
       </w:r>
       <w:r>
-        <w:t xml:space="preserve">la página del repositorio en GitHub mostrando la carpeta practica5-grpc con proto/, proto-v1/, </w:t>
-      </w:r>
-      <w:proofErr w:type="spellStart"/>
-      <w:r>
-        <w:t>src</w:t>
-      </w:r>
-      <w:proofErr w:type="spellEnd"/>
-      <w:r>
-        <w:t xml:space="preserve">/, el </w:t>
-      </w:r>
-      <w:proofErr w:type="spellStart"/>
-      <w:r>
-        <w:t>Dockerfile</w:t>
-      </w:r>
-      <w:proofErr w:type="spellEnd"/>
-      <w:r>
-        <w:t xml:space="preserve"> y el README.</w:t>
+        <w:t>la página del repositorio en GitHub mostrando la carpeta practica5-grpc con proto/, proto-v1/, src/, el Dockerfile y el README.</w:t>
       </w:r>
     </w:p>
     <w:tbl>
@@ -4975,15 +4031,9 @@
         <w:tblLook w:val="04A0" w:firstRow="1" w:lastRow="0" w:firstColumn="1" w:lastColumn="0" w:noHBand="0" w:noVBand="1"/>
       </w:tblPr>
       <w:tblGrid>
-        <w:gridCol w:w="9746"/>
+        <w:gridCol w:w="9950"/>
       </w:tblGrid>
       <w:tr>
-        <w:tblPrEx>
-          <w:tblCellMar>
-            <w:top w:w="0" w:type="dxa"/>
-            <w:bottom w:w="0" w:type="dxa"/>
-          </w:tblCellMar>
-        </w:tblPrEx>
         <w:trPr>
           <w:trHeight w:val="2100"/>
         </w:trPr>
@@ -5005,22 +4055,44 @@
             </w:pPr>
             <w:r>
               <w:rPr>
-                <w:i/>
-                <w:iCs/>
-                <w:color w:val="8F9EAA"/>
+                <w:noProof/>
               </w:rPr>
-              <w:t xml:space="preserve">[ Pegue aquí la captura de </w:t>
-            </w:r>
-            <w:proofErr w:type="gramStart"/>
-            <w:r>
-              <w:rPr>
-                <w:i/>
-                <w:iCs/>
-                <w:color w:val="8F9EAA"/>
-              </w:rPr>
-              <w:t>pantalla ]</w:t>
-            </w:r>
-            <w:proofErr w:type="gramEnd"/>
+              <w:drawing>
+                <wp:inline distT="0" distB="0" distL="0" distR="0" wp14:anchorId="3C78BA6E" wp14:editId="7E94CFD2">
+                  <wp:extent cx="6188710" cy="2751455"/>
+                  <wp:effectExtent l="0" t="0" r="2540" b="0"/>
+                  <wp:docPr id="22" name="Imagen 22"/>
+                  <wp:cNvGraphicFramePr>
+                    <a:graphicFrameLocks xmlns:a="http://schemas.openxmlformats.org/drawingml/2006/main" noChangeAspect="1"/>
+                  </wp:cNvGraphicFramePr>
+                  <a:graphic xmlns:a="http://schemas.openxmlformats.org/drawingml/2006/main">
+                    <a:graphicData uri="http://schemas.openxmlformats.org/drawingml/2006/picture">
+                      <pic:pic xmlns:pic="http://schemas.openxmlformats.org/drawingml/2006/picture">
+                        <pic:nvPicPr>
+                          <pic:cNvPr id="1" name=""/>
+                          <pic:cNvPicPr/>
+                        </pic:nvPicPr>
+                        <pic:blipFill>
+                          <a:blip r:embed="rId29"/>
+                          <a:stretch>
+                            <a:fillRect/>
+                          </a:stretch>
+                        </pic:blipFill>
+                        <pic:spPr>
+                          <a:xfrm>
+                            <a:off x="0" y="0"/>
+                            <a:ext cx="6188710" cy="2751455"/>
+                          </a:xfrm>
+                          <a:prstGeom prst="rect">
+                            <a:avLst/>
+                          </a:prstGeom>
+                        </pic:spPr>
+                      </pic:pic>
+                    </a:graphicData>
+                  </a:graphic>
+                </wp:inline>
+              </w:drawing>
+            </w:r>
           </w:p>
         </w:tc>
       </w:tr>
@@ -5045,6 +4117,7 @@
           <w:sz w:val="24"/>
           <w:szCs w:val="24"/>
         </w:rPr>
+        <w:lastRenderedPageBreak/>
         <w:t>Cierre de la Parte 1</w:t>
       </w:r>
     </w:p>
@@ -5067,14 +4140,7 @@
           <w:b/>
           <w:bCs/>
         </w:rPr>
-        <w:t>¿Qué parte de la práctica le</w:t>
-      </w:r>
-      <w:r>
-        <w:rPr>
-          <w:b/>
-          <w:bCs/>
-        </w:rPr>
-        <w:t xml:space="preserve"> resultó más difícil y por qué?</w:t>
+        <w:t>¿Qué parte de la práctica le resultó más difícil y por qué?</w:t>
       </w:r>
     </w:p>
     <w:tbl>
@@ -5098,12 +4164,6 @@
         <w:gridCol w:w="9746"/>
       </w:tblGrid>
       <w:tr>
-        <w:tblPrEx>
-          <w:tblCellMar>
-            <w:top w:w="0" w:type="dxa"/>
-            <w:bottom w:w="0" w:type="dxa"/>
-          </w:tblCellMar>
-        </w:tblPrEx>
         <w:trPr>
           <w:trHeight w:val="900"/>
         </w:trPr>
@@ -5120,39 +4180,7 @@
           </w:tcPr>
           <w:p>
             <w:r>
-              <w:t xml:space="preserve">La instalación de </w:t>
-            </w:r>
-            <w:proofErr w:type="spellStart"/>
-            <w:r>
-              <w:t>grpcurl</w:t>
-            </w:r>
-            <w:proofErr w:type="spellEnd"/>
-            <w:r>
-              <w:t xml:space="preserve">, había que bajarlo del repositorio de </w:t>
-            </w:r>
-            <w:proofErr w:type="spellStart"/>
-            <w:r>
-              <w:t>github</w:t>
-            </w:r>
-            <w:proofErr w:type="spellEnd"/>
-            <w:r>
-              <w:t xml:space="preserve"> y correrlo con el </w:t>
-            </w:r>
-            <w:proofErr w:type="gramStart"/>
-            <w:r>
-              <w:t>comando .</w:t>
-            </w:r>
-            <w:proofErr w:type="gramEnd"/>
-            <w:r>
-              <w:t>/</w:t>
-            </w:r>
-            <w:proofErr w:type="spellStart"/>
-            <w:r>
-              <w:t>gpcurl,exe</w:t>
-            </w:r>
-            <w:proofErr w:type="spellEnd"/>
-            <w:r>
-              <w:t xml:space="preserve"> correctamente </w:t>
+              <w:t xml:space="preserve">La instalación de grpcurl, había que bajarlo del repositorio de github y correrlo con el comando ./gpcurl,exe correctamente </w:t>
             </w:r>
           </w:p>
         </w:tc>
@@ -5197,12 +4225,6 @@
         <w:gridCol w:w="9746"/>
       </w:tblGrid>
       <w:tr>
-        <w:tblPrEx>
-          <w:tblCellMar>
-            <w:top w:w="0" w:type="dxa"/>
-            <w:bottom w:w="0" w:type="dxa"/>
-          </w:tblCellMar>
-        </w:tblPrEx>
         <w:trPr>
           <w:trHeight w:val="900"/>
         </w:trPr>
@@ -5219,38 +4241,7 @@
           </w:tcPr>
           <w:p>
             <w:r>
-              <w:lastRenderedPageBreak/>
-              <w:t>A</w:t>
-            </w:r>
-            <w:r>
-              <w:t xml:space="preserve">daptar el resto de los comandos </w:t>
-            </w:r>
-            <w:proofErr w:type="gramStart"/>
-            <w:r>
-              <w:t>que  usan</w:t>
-            </w:r>
-            <w:proofErr w:type="gramEnd"/>
-            <w:r>
-              <w:t xml:space="preserve"> </w:t>
-            </w:r>
-            <w:proofErr w:type="spellStart"/>
-            <w:r>
-              <w:t>gpcurl</w:t>
-            </w:r>
-            <w:proofErr w:type="spellEnd"/>
-            <w:r>
-              <w:t xml:space="preserve"> </w:t>
-            </w:r>
-            <w:r>
-              <w:t xml:space="preserve">debido a un problema con las comillas que ocurre en </w:t>
-            </w:r>
-            <w:proofErr w:type="spellStart"/>
-            <w:r>
-              <w:t>powershell</w:t>
-            </w:r>
-            <w:proofErr w:type="spellEnd"/>
-            <w:r>
-              <w:t>, tuve que reescribir el comando para que funcione.</w:t>
+              <w:t>Adaptar el resto de los comandos que  usan gpcurl debido a un problema con las comillas que ocurre en powershell, tuve que reescribir el comando para que funcione.</w:t>
             </w:r>
           </w:p>
         </w:tc>
@@ -5295,12 +4286,6 @@
         <w:gridCol w:w="9746"/>
       </w:tblGrid>
       <w:tr>
-        <w:tblPrEx>
-          <w:tblCellMar>
-            <w:top w:w="0" w:type="dxa"/>
-            <w:bottom w:w="0" w:type="dxa"/>
-          </w:tblCellMar>
-        </w:tblPrEx>
         <w:trPr>
           <w:trHeight w:val="900"/>
         </w:trPr>
@@ -5354,12 +4339,6 @@
         <w:gridCol w:w="9746"/>
       </w:tblGrid>
       <w:tr>
-        <w:tblPrEx>
-          <w:tblCellMar>
-            <w:top w:w="0" w:type="dxa"/>
-            <w:bottom w:w="0" w:type="dxa"/>
-          </w:tblCellMar>
-        </w:tblPrEx>
         <w:tc>
           <w:tcPr>
             <w:tcW w:w="9746" w:type="dxa"/>
@@ -5418,7 +4397,7 @@
                 <wp:cNvGraphicFramePr/>
                 <a:graphic xmlns:a="http://schemas.openxmlformats.org/drawingml/2006/main">
                   <a:graphicData uri="http://schemas.microsoft.com/office/word/2010/wordprocessingInk">
-                    <w14:contentPart bwMode="auto" r:id="rId29">
+                    <w14:contentPart bwMode="auto" r:id="rId30">
                       <w14:nvContentPartPr>
                         <w14:cNvContentPartPr/>
                       </w14:nvContentPartPr>
@@ -5454,7 +4433,7 @@
                 <o:lock v:ext="edit" aspectratio="t"/>
               </v:shapetype>
               <v:shape id="Entrada de lápiz 28" o:spid="_x0000_s1026" type="#_x0000_t75" style="position:absolute;margin-left:89.15pt;margin-top:-3.15pt;width:66.35pt;height:62.45pt;z-index:251662336;visibility:visible;mso-wrap-style:square;mso-wrap-distance-left:9pt;mso-wrap-distance-top:0;mso-wrap-distance-right:9pt;mso-wrap-distance-bottom:0;mso-position-horizontal:absolute;mso-position-horizontal-relative:text;mso-position-vertical:absolute;mso-position-vertical-relative:text" o:gfxdata="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">
-                <v:imagedata r:id="rId30" o:title=""/>
+                <v:imagedata r:id="rId31" o:title=""/>
               </v:shape>
             </w:pict>
           </mc:Fallback>
@@ -5482,7 +4461,7 @@
                 <wp:cNvGraphicFramePr/>
                 <a:graphic xmlns:a="http://schemas.openxmlformats.org/drawingml/2006/main">
                   <a:graphicData uri="http://schemas.microsoft.com/office/word/2010/wordprocessingInk">
-                    <w14:contentPart bwMode="auto" r:id="rId31">
+                    <w14:contentPart bwMode="auto" r:id="rId32">
                       <w14:nvContentPartPr>
                         <w14:cNvContentPartPr/>
                       </w14:nvContentPartPr>
@@ -5499,7 +4478,7 @@
           <mc:Fallback>
             <w:pict>
               <v:shape w14:anchorId="341CCAE0" id="Entrada de lápiz 25" o:spid="_x0000_s1026" type="#_x0000_t75" style="position:absolute;margin-left:113.3pt;margin-top:.05pt;width:1.45pt;height:1.45pt;z-index:251659264;visibility:visible;mso-wrap-style:square;mso-wrap-distance-left:9pt;mso-wrap-distance-top:0;mso-wrap-distance-right:9pt;mso-wrap-distance-bottom:0;mso-position-horizontal:absolute;mso-position-horizontal-relative:text;mso-position-vertical:absolute;mso-position-vertical-relative:text" o:gfxdata="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">
-                <v:imagedata r:id="rId32" o:title=""/>
+                <v:imagedata r:id="rId33" o:title=""/>
               </v:shape>
             </w:pict>
           </mc:Fallback>
@@ -5523,12 +4502,6 @@
         <w:gridCol w:w="4873"/>
       </w:tblGrid>
       <w:tr>
-        <w:tblPrEx>
-          <w:tblCellMar>
-            <w:top w:w="0" w:type="dxa"/>
-            <w:bottom w:w="0" w:type="dxa"/>
-          </w:tblCellMar>
-        </w:tblPrEx>
         <w:tc>
           <w:tcPr>
             <w:tcW w:w="4873" w:type="dxa"/>
@@ -5584,10 +4557,7 @@
               <w:t>10/09/2026</w:t>
             </w:r>
             <w:r>
-              <w:t>___________</w:t>
-            </w:r>
-            <w:r>
-              <w:t>______</w:t>
+              <w:t>_________________</w:t>
             </w:r>
           </w:p>
           <w:p>
@@ -5608,8 +4578,8 @@
     </w:tbl>
     <w:p/>
     <w:sectPr>
-      <w:headerReference w:type="default" r:id="rId33"/>
-      <w:footerReference w:type="default" r:id="rId34"/>
+      <w:headerReference w:type="default" r:id="rId34"/>
+      <w:footerReference w:type="default" r:id="rId35"/>
       <w:pgSz w:w="11906" w:h="16838"/>
       <w:pgMar w:top="1400" w:right="1080" w:bottom="1080" w:left="1080" w:header="560" w:footer="400" w:gutter="0"/>
       <w:cols w:space="720"/>
@@ -5652,33 +4622,7 @@
         <w:sz w:val="15"/>
         <w:szCs w:val="15"/>
       </w:rPr>
-      <w:t xml:space="preserve">COM-600 Microservicios · Práctica N.º 5 · Hoja de </w:t>
-    </w:r>
-    <w:proofErr w:type="spellStart"/>
-    <w:r>
-      <w:rPr>
-        <w:color w:val="8F9EAA"/>
-        <w:sz w:val="15"/>
-        <w:szCs w:val="15"/>
-      </w:rPr>
-      <w:t>Evidencias</w:t>
-    </w:r>
-    <w:r>
-      <w:rPr>
-        <w:color w:val="8F9EAA"/>
-        <w:sz w:val="15"/>
-        <w:szCs w:val="15"/>
-      </w:rPr>
-      <w:t>Página</w:t>
-    </w:r>
-    <w:proofErr w:type="spellEnd"/>
-    <w:r>
-      <w:rPr>
-        <w:color w:val="8F9EAA"/>
-        <w:sz w:val="15"/>
-        <w:szCs w:val="15"/>
-      </w:rPr>
-      <w:t xml:space="preserve"> </w:t>
+      <w:t xml:space="preserve">COM-600 Microservicios · Práctica N.º 5 · Hoja de EvidenciasPágina </w:t>
     </w:r>
     <w:r>
       <w:rPr>
@@ -5812,12 +4756,6 @@
       <w:gridCol w:w="3346"/>
     </w:tblGrid>
     <w:tr>
-      <w:tblPrEx>
-        <w:tblCellMar>
-          <w:top w:w="0" w:type="dxa"/>
-          <w:bottom w:w="0" w:type="dxa"/>
-        </w:tblCellMar>
-      </w:tblPrEx>
       <w:tc>
         <w:tcPr>
           <w:tcW w:w="6400" w:type="dxa"/>
@@ -5870,7 +4808,6 @@
           <w:pPr>
             <w:jc w:val="right"/>
           </w:pPr>
-          <w:proofErr w:type="gramStart"/>
           <w:r>
             <w:rPr>
               <w:b/>
@@ -5879,18 +4816,7 @@
               <w:sz w:val="15"/>
               <w:szCs w:val="15"/>
             </w:rPr>
-            <w:t>PRÁCTICA N.º</w:t>
-          </w:r>
-          <w:proofErr w:type="gramEnd"/>
-          <w:r>
-            <w:rPr>
-              <w:b/>
-              <w:bCs/>
-              <w:color w:val="1F8A7A"/>
-              <w:sz w:val="15"/>
-              <w:szCs w:val="15"/>
-            </w:rPr>
-            <w:t xml:space="preserve"> 5</w:t>
+            <w:t>PRÁCTICA N.º 5</w:t>
           </w:r>
         </w:p>
       </w:tc>

</xml_diff>